<commit_message>
feat(app): agregar dashboard de presentacion interactivo
Nuevo modo "Dashboard de presentacion" en la app de Streamlit
(app/dashboard.py) con storytelling del EDA, tecnica de mineria
(comparacion de modelos, importancia de variables, ROC) y un umbral
de decision interactivo que recalcula precision/recall/F1 y la
matriz de confusion en vivo sobre el hold-out de test real. Pensado
para la exposicion de 15 minutos sin depender del notebook ni de
slides estaticas.

Tema de Altair con fondo blanco fijo para que los graficos se lean
bien sin importar el tema (claro/oscuro) de Streamlit.

Tambien: se agrega la seccion de Conclusion (Data Visualization +
storytelling) que faltaba en el Word del grupo, con las figuras
reales exportadas al reejecutar el notebook de punta a punta.
</commit_message>
<xml_diff>
--- a/Trabajo Practico Obligatorio - Ciencia de Datos.docx
+++ b/Trabajo Practico Obligatorio - Ciencia de Datos.docx
@@ -4936,6 +4936,429 @@
           <w:rtl w:val="0"/>
         </w:rPr>
         <w:t xml:space="preserve">De este modo, la salida del modelo se traduce directamente en decisiones operativas: cada turno recuperado equivale a una hora efectiva de atención, materializando la propuesta de valor y manteniendo la coherencia entre la hipótesis y la conclusión que exige la consigna.</w:t>
+      </w:r>
+    </w:p>
+    <w:p>
+      <w:pPr>
+        <w:pStyle w:val="Heading1"/>
+      </w:pPr>
+      <w:r>
+        <w:t>8. Conclusión (Data Visualization + storytelling)</w:t>
+      </w:r>
+    </w:p>
+    <w:p>
+      <w:pPr>
+        <w:pStyle w:val="Heading2"/>
+      </w:pPr>
+      <w:r>
+        <w:t>8.1. Coherencia entre la hipótesis y los resultados</w:t>
+      </w:r>
+    </w:p>
+    <w:p>
+      <w:pPr/>
+      <w:r>
+        <w:t>La hipótesis planteaba que el no-show no es aleatorio y que variables observables al momento de agendar el turno (anticipación, edad, día de la semana, barrio, comorbilidades y, como fuente secundaria, el clima) permiten estimar la probabilidad de ausencia con una capacidad de discriminación útil para el negocio. Los resultados sostienen esa hipótesis: el Random Forest alcanza un ROC-AUC de test de 0,733 (muy por encima del azar, 0,5), y el ranking de importancia de variables coincide con los hallazgos del análisis exploratorio.</w:t>
+      </w:r>
+    </w:p>
+    <w:p>
+      <w:pPr>
+        <w:pStyle w:val="Heading2"/>
+      </w:pPr>
+      <w:r>
+        <w:t>8.2. Hallazgos del EDA (storytelling)</w:t>
+      </w:r>
+    </w:p>
+    <w:p>
+      <w:pPr/>
+      <w:r>
+        <w:t>El ausentismo afecta al 20,2 % de los turnos (22.319 de 110.527), un desbalance de clases que obliga a evaluar con precision/recall/ROC-AUC en vez de accuracy.</w:t>
+      </w:r>
+    </w:p>
+    <w:p>
+      <w:r>
+        <w:drawing>
+          <wp:inline>
+            <wp:extent cx="3600000" cy="2880000"/>
+            <wp:docPr id="2" name="Picture 2"/>
+            <wp:cNvGraphicFramePr>
+              <a:graphicFrameLocks noChangeAspect="1"/>
+            </wp:cNvGraphicFramePr>
+            <a:graphic>
+              <a:graphicData uri="http://schemas.openxmlformats.org/drawingml/2006/picture">
+                <pic:pic>
+                  <pic:nvPicPr>
+                    <pic:cNvPr id="0" name="target_distribution.png"/>
+                    <pic:cNvPicPr/>
+                  </pic:nvPicPr>
+                  <pic:blipFill>
+                    <a:blip r:embed="rId10"/>
+                    <a:stretch>
+                      <a:fillRect/>
+                    </a:stretch>
+                  </pic:blipFill>
+                  <pic:spPr>
+                    <a:xfrm>
+                      <a:off x="0" y="0"/>
+                      <a:ext cx="3600000" cy="2880000"/>
+                    </a:xfrm>
+                    <a:prstGeom prst="rect"/>
+                  </pic:spPr>
+                </pic:pic>
+              </a:graphicData>
+            </a:graphic>
+          </wp:inline>
+        </w:drawing>
+      </w:r>
+    </w:p>
+    <w:p>
+      <w:pPr/>
+      <w:r>
+        <w:rPr>
+          <w:i/>
+        </w:rPr>
+        <w:t>Figura 1. Distribución del target: 79,8 % show vs. 20,2 % no_show.</w:t>
+      </w:r>
+    </w:p>
+    <w:p>
+      <w:pPr/>
+      <w:r>
+        <w:t>La anticipación con la que se agenda el turno (lead_time_days) es la señal más fuerte: los turnos agendados con más días de antelación muestran una mediana de lead time claramente mayor entre quienes faltan que entre quienes asisten; los turnos agendados el mismo día (same_day) casi no registran ausencias.</w:t>
+      </w:r>
+    </w:p>
+    <w:p>
+      <w:r>
+        <w:drawing>
+          <wp:inline>
+            <wp:extent cx="5040000" cy="1890000"/>
+            <wp:docPr id="3" name="Picture 3"/>
+            <wp:cNvGraphicFramePr>
+              <a:graphicFrameLocks noChangeAspect="1"/>
+            </wp:cNvGraphicFramePr>
+            <a:graphic>
+              <a:graphicData uri="http://schemas.openxmlformats.org/drawingml/2006/picture">
+                <pic:pic>
+                  <pic:nvPicPr>
+                    <pic:cNvPr id="0" name="lead_time_vs_noshow.png"/>
+                    <pic:cNvPicPr/>
+                  </pic:nvPicPr>
+                  <pic:blipFill>
+                    <a:blip r:embed="rId11"/>
+                    <a:stretch>
+                      <a:fillRect/>
+                    </a:stretch>
+                  </pic:blipFill>
+                  <pic:spPr>
+                    <a:xfrm>
+                      <a:off x="0" y="0"/>
+                      <a:ext cx="5040000" cy="1890000"/>
+                    </a:xfrm>
+                    <a:prstGeom prst="rect"/>
+                  </pic:spPr>
+                </pic:pic>
+              </a:graphicData>
+            </a:graphic>
+          </wp:inline>
+        </w:drawing>
+      </w:r>
+    </w:p>
+    <w:p>
+      <w:pPr/>
+      <w:r>
+        <w:rPr>
+          <w:i/>
+        </w:rPr>
+        <w:t>Figura 2. Lead time (días de anticipación) por clase: quienes faltan agendan con más anticipación.</w:t>
+      </w:r>
+    </w:p>
+    <w:p>
+      <w:pPr/>
+      <w:r>
+        <w:t>La tasa de no-show también varía por grupo etario: es más alta entre menores y adultos, y notablemente más baja entre adultos mayores (65+), consistente con una mayor disponibilidad de tiempo y turnos de control por comorbilidades crónicas en ese grupo.</w:t>
+      </w:r>
+    </w:p>
+    <w:p>
+      <w:r>
+        <w:drawing>
+          <wp:inline>
+            <wp:extent cx="3600000" cy="2400000"/>
+            <wp:docPr id="4" name="Picture 4"/>
+            <wp:cNvGraphicFramePr>
+              <a:graphicFrameLocks noChangeAspect="1"/>
+            </wp:cNvGraphicFramePr>
+            <a:graphic>
+              <a:graphicData uri="http://schemas.openxmlformats.org/drawingml/2006/picture">
+                <pic:pic>
+                  <pic:nvPicPr>
+                    <pic:cNvPr id="0" name="noshow_by_age_group.png"/>
+                    <pic:cNvPicPr/>
+                  </pic:nvPicPr>
+                  <pic:blipFill>
+                    <a:blip r:embed="rId12"/>
+                    <a:stretch>
+                      <a:fillRect/>
+                    </a:stretch>
+                  </pic:blipFill>
+                  <pic:spPr>
+                    <a:xfrm>
+                      <a:off x="0" y="0"/>
+                      <a:ext cx="3600000" cy="2400000"/>
+                    </a:xfrm>
+                    <a:prstGeom prst="rect"/>
+                  </pic:spPr>
+                </pic:pic>
+              </a:graphicData>
+            </a:graphic>
+          </wp:inline>
+        </w:drawing>
+      </w:r>
+    </w:p>
+    <w:p>
+      <w:pPr/>
+      <w:r>
+        <w:rPr>
+          <w:i/>
+        </w:rPr>
+        <w:t>Figura 3. Tasa de no-show por grupo etario.</w:t>
+      </w:r>
+    </w:p>
+    <w:p>
+      <w:pPr/>
+      <w:r>
+        <w:t>Caveat causal: los turnos que recibieron SMS muestran, a simple vista, una tasa de no-show más alta, no más baja. Esto no significa que el SMS aumente el ausentismo: el sistema solo envía SMS a turnos agendados con suficiente anticipación, por lo que SMS_received está confundido con lead_time_days. Aislar el efecto real del recordatorio requeriría un diseño experimental (A/B test) fuera del alcance de este TP — se documenta explícitamente para no inducir a la Gerencia a la conclusión errónea de eliminar el recordatorio.</w:t>
+      </w:r>
+    </w:p>
+    <w:p>
+      <w:pPr/>
+      <w:r>
+        <w:t>El clima del día del turno (estación INMET A612, Vitória) aporta una señal débil frente al comportamiento del paciente: la diferencia de tasa de no-show entre días con y sin lluvia es de apenas unos pocos puntos porcentuales. Es un hallazgo honesto, no un fracaso: confirma que la inversión de negocio debe orientarse al lead time y no al pronóstico del tiempo, a la vez que satisface el requisito superador de integrar una segunda fuente de datos real.</w:t>
+      </w:r>
+    </w:p>
+    <w:p>
+      <w:r>
+        <w:drawing>
+          <wp:inline>
+            <wp:extent cx="4320000" cy="3456000"/>
+            <wp:docPr id="5" name="Picture 5"/>
+            <wp:cNvGraphicFramePr>
+              <a:graphicFrameLocks noChangeAspect="1"/>
+            </wp:cNvGraphicFramePr>
+            <a:graphic>
+              <a:graphicData uri="http://schemas.openxmlformats.org/drawingml/2006/picture">
+                <pic:pic>
+                  <pic:nvPicPr>
+                    <pic:cNvPr id="0" name="correlation_heatmap.png"/>
+                    <pic:cNvPicPr/>
+                  </pic:nvPicPr>
+                  <pic:blipFill>
+                    <a:blip r:embed="rId13"/>
+                    <a:stretch>
+                      <a:fillRect/>
+                    </a:stretch>
+                  </pic:blipFill>
+                  <pic:spPr>
+                    <a:xfrm>
+                      <a:off x="0" y="0"/>
+                      <a:ext cx="4320000" cy="3456000"/>
+                    </a:xfrm>
+                    <a:prstGeom prst="rect"/>
+                  </pic:spPr>
+                </pic:pic>
+              </a:graphicData>
+            </a:graphic>
+          </wp:inline>
+        </w:drawing>
+      </w:r>
+    </w:p>
+    <w:p>
+      <w:pPr/>
+      <w:r>
+        <w:rPr>
+          <w:i/>
+        </w:rPr>
+        <w:t>Figura 4. Matriz de correlación de variables numéricas con el target.</w:t>
+      </w:r>
+    </w:p>
+    <w:p>
+      <w:pPr>
+        <w:pStyle w:val="Heading2"/>
+      </w:pPr>
+      <w:r>
+        <w:t>8.3. Técnica de minería: modelo, evaluación y umbral de decisión</w:t>
+      </w:r>
+    </w:p>
+    <w:p>
+      <w:pPr/>
+      <w:r>
+        <w:t>Se compararon dos modelos de clasificación binaria por validación cruzada estratificada (StratifiedKFold, 5 folds): un Árbol de Decisión podado (max_depth=6, min_samples_leaf=50) y un Random Forest sin podar (n_estimators=300, max_depth=12, min_samples_leaf=5, max_features='sqrt'). El Random Forest fue elegido por su mejor ROC-AUC de validación cruzada (0,739 ± 0,003 vs. 0,726 ± 0,004 del Árbol de Decisión).</w:t>
+      </w:r>
+    </w:p>
+    <w:p>
+      <w:r>
+        <w:drawing>
+          <wp:inline>
+            <wp:extent cx="3960000" cy="2970000"/>
+            <wp:docPr id="6" name="Picture 6"/>
+            <wp:cNvGraphicFramePr>
+              <a:graphicFrameLocks noChangeAspect="1"/>
+            </wp:cNvGraphicFramePr>
+            <a:graphic>
+              <a:graphicData uri="http://schemas.openxmlformats.org/drawingml/2006/picture">
+                <pic:pic>
+                  <pic:nvPicPr>
+                    <pic:cNvPr id="0" name="feature_importances.png"/>
+                    <pic:cNvPicPr/>
+                  </pic:nvPicPr>
+                  <pic:blipFill>
+                    <a:blip r:embed="rId14"/>
+                    <a:stretch>
+                      <a:fillRect/>
+                    </a:stretch>
+                  </pic:blipFill>
+                  <pic:spPr>
+                    <a:xfrm>
+                      <a:off x="0" y="0"/>
+                      <a:ext cx="3960000" cy="2970000"/>
+                    </a:xfrm>
+                    <a:prstGeom prst="rect"/>
+                  </pic:spPr>
+                </pic:pic>
+              </a:graphicData>
+            </a:graphic>
+          </wp:inline>
+        </w:drawing>
+      </w:r>
+    </w:p>
+    <w:p>
+      <w:pPr/>
+      <w:r>
+        <w:rPr>
+          <w:i/>
+        </w:rPr>
+        <w:t>Figura 5. Importancia de variables del Random Forest: lead_time_days y same_day encabezan el ranking.</w:t>
+      </w:r>
+    </w:p>
+    <w:p>
+      <w:r>
+        <w:drawing>
+          <wp:inline>
+            <wp:extent cx="3600000" cy="3600000"/>
+            <wp:docPr id="7" name="Picture 7"/>
+            <wp:cNvGraphicFramePr>
+              <a:graphicFrameLocks noChangeAspect="1"/>
+            </wp:cNvGraphicFramePr>
+            <a:graphic>
+              <a:graphicData uri="http://schemas.openxmlformats.org/drawingml/2006/picture">
+                <pic:pic>
+                  <pic:nvPicPr>
+                    <pic:cNvPr id="0" name="roc_curve.png"/>
+                    <pic:cNvPicPr/>
+                  </pic:nvPicPr>
+                  <pic:blipFill>
+                    <a:blip r:embed="rId15"/>
+                    <a:stretch>
+                      <a:fillRect/>
+                    </a:stretch>
+                  </pic:blipFill>
+                  <pic:spPr>
+                    <a:xfrm>
+                      <a:off x="0" y="0"/>
+                      <a:ext cx="3600000" cy="3600000"/>
+                    </a:xfrm>
+                    <a:prstGeom prst="rect"/>
+                  </pic:spPr>
+                </pic:pic>
+              </a:graphicData>
+            </a:graphic>
+          </wp:inline>
+        </w:drawing>
+      </w:r>
+    </w:p>
+    <w:p>
+      <w:pPr/>
+      <w:r>
+        <w:rPr>
+          <w:i/>
+        </w:rPr>
+        <w:t>Figura 6. Curva ROC del modelo elegido sobre el hold-out de test (AUC = 0,733).</w:t>
+      </w:r>
+    </w:p>
+    <w:p>
+      <w:pPr/>
+      <w:r>
+        <w:t>Dado que el costo de un Falso Negativo (no detectar un no-show real: la franja queda vacía sin acción preventiva) es mucho mayor que el de un Falso Positivo (recordatorio o sobreturno de más), se ajustó el umbral de decisión desde el 0,5 por defecto hacia un umbral orientado a recall. Bajando el umbral a 0,25, el recall de la clase no_show sube de ~0 % a ≈72 % (F1≈0,45), a costa de una precision más baja — un intercambio deseable dado el costo asimétrico del negocio.</w:t>
+      </w:r>
+    </w:p>
+    <w:p>
+      <w:r>
+        <w:drawing>
+          <wp:inline>
+            <wp:extent cx="4320000" cy="2777143"/>
+            <wp:docPr id="8" name="Picture 8"/>
+            <wp:cNvGraphicFramePr>
+              <a:graphicFrameLocks noChangeAspect="1"/>
+            </wp:cNvGraphicFramePr>
+            <a:graphic>
+              <a:graphicData uri="http://schemas.openxmlformats.org/drawingml/2006/picture">
+                <pic:pic>
+                  <pic:nvPicPr>
+                    <pic:cNvPr id="0" name="threshold_analysis.png"/>
+                    <pic:cNvPicPr/>
+                  </pic:nvPicPr>
+                  <pic:blipFill>
+                    <a:blip r:embed="rId16"/>
+                    <a:stretch>
+                      <a:fillRect/>
+                    </a:stretch>
+                  </pic:blipFill>
+                  <pic:spPr>
+                    <a:xfrm>
+                      <a:off x="0" y="0"/>
+                      <a:ext cx="4320000" cy="2777143"/>
+                    </a:xfrm>
+                    <a:prstGeom prst="rect"/>
+                  </pic:spPr>
+                </pic:pic>
+              </a:graphicData>
+            </a:graphic>
+          </wp:inline>
+        </w:drawing>
+      </w:r>
+    </w:p>
+    <w:p>
+      <w:pPr/>
+      <w:r>
+        <w:rPr>
+          <w:i/>
+        </w:rPr>
+        <w:t>Figura 7. Precision/recall/F1 según el umbral de decisión; el umbral orientado a recall (0,25) queda cerca de la banda RISK_LOW (0,28) que usa la aplicación.</w:t>
+      </w:r>
+    </w:p>
+    <w:p>
+      <w:pPr>
+        <w:pStyle w:val="Heading2"/>
+      </w:pPr>
+      <w:r>
+        <w:t>8.4. Valor de negocio estimado</w:t>
+      </w:r>
+    </w:p>
+    <w:p>
+      <w:pPr/>
+      <w:r>
+        <w:t>Con el umbral orientado a recall (~0,25), el modelo detecta ≈72 % de los no-show reales del hold-out de test (4.463 casos), es decir, identifica con antelación unos 3.213 turnos que efectivamente iban a resultar en ausencia, sobre los cuales la institución puede accionar (recordatorio reforzado o sobreturno) antes de que la franja quede vacía sin aviso. Cada no-show anticipado y compensado con un sobreturno representa una hora-profesional recuperada; la aplicación funcional (Streamlit) permite estimar esta cifra de forma interactiva sobre una agenda real, variando el umbral y el modo de uso (turno individual o lote).</w:t>
+      </w:r>
+    </w:p>
+    <w:p>
+      <w:pPr>
+        <w:pStyle w:val="Heading2"/>
+      </w:pPr>
+      <w:r>
+        <w:t>8.5. Limitaciones</w:t>
+      </w:r>
+    </w:p>
+    <w:p>
+      <w:pPr/>
+      <w:r>
+        <w:t>Los datos corresponden a 2016, a una única ciudad (Vitória, ES, Brasil) y son pre-COVID: los patrones de asistencia a salud pueden haber cambiado estructuralmente desde entonces, por lo que el modelo no debe aplicarse tal cual a otra geografía o período sin revalidar. Además, existe concept drift esperable (estacionalidad, políticas de turnos, composición socioeconómica de los pacientes), por lo que se recomienda reentrenar periódicamente y monitorear ROC-AUC/recall en producción. La ventana de clima cubierta es acotada (~1,5 meses de 2016), y el efecto del SMS sobre el no-show está confundido con el lead time, por lo que no puede interpretarse causalmente sin un diseño experimental controlado. Finalmente, se trata de un modelo académico (TPO): no hay monitoreo continuo ni reentrenamiento automático en producción.</w:t>
       </w:r>
     </w:p>
     <w:sectPr>

</xml_diff>